<commit_message>
Word L2 letters: ministry addressee right, single-page spacing
- Cap ministry recipient address column width so short addressee blocks align on the right; keep left alignment inside the cell.

- Remove layout-only empty paragraphs; merge spacing into adjacent blocks (Inv+WP and Visa+WP Ext); tune salutation and signatory twips.

- PreviewWordReports: composite phrases so single-digit TotalPersonCount highlights in Goşundy lines.

- Regenerate Module .docx templates from GenerateTemplates.

- Record App_Visa_And_WP_Ext_Letter runtime sign-off (review-status, app maps, word map, learnings).

Co-authored-by: Cursor <cursoragent@cursor.com>
</commit_message>
<xml_diff>
--- a/Visa2026.Module/Resources/App_Inv_And_WP_Letter.docx
+++ b/Visa2026.Module/Resources/App_Inv_And_WP_Letter.docx
@@ -30,69 +30,113 @@
         <w:t xml:space="preserve">{{ds.ApplicationDate}} ý.</w:t>
       </w:r>
     </w:p>
-    <w:p>
-      <w:pPr>
-        <w:jc w:val="right"/>
-        <w:spacing w:after="24"/>
-      </w:pPr>
-      <w:r>
-        <w:rPr>
-          <w:rFonts w:ascii="Times New Roman" w:hAnsi="Times New Roman"/>
-          <w:sz w:val="30"/>
-          <w:b/>
-        </w:rPr>
-        <w:t xml:space="preserve">{{ds.ProjectContract_Ministry_RecipientBlock_Line1}}</w:t>
-      </w:r>
-    </w:p>
-    <w:p>
-      <w:pPr>
-        <w:jc w:val="right"/>
-        <w:ind w:left="720"/>
+    <w:tbl>
+      <w:tblPr>
+        <w:tblW w:w="9506" w:type="dxa"/>
+        <w:tblLayout w:type="fixed"/>
+        <w:tblBorders>
+          <w:top w:val="nil"/>
+          <w:left w:val="nil"/>
+          <w:bottom w:val="nil"/>
+          <w:right w:val="nil"/>
+          <w:insideH w:val="nil"/>
+          <w:insideV w:val="nil"/>
+        </w:tblBorders>
+      </w:tblPr>
+      <w:tblGrid>
+        <w:gridCol w:w="3106"/>
+        <w:gridCol w:w="6400"/>
+      </w:tblGrid>
+      <w:tr>
+        <w:tc>
+          <w:tcPr>
+            <w:tcW w:w="3106" w:type="dxa"/>
+            <w:vAlign w:val="top"/>
+            <w:tcBorders>
+              <w:top w:val="nil"/>
+              <w:left w:val="nil"/>
+              <w:bottom w:val="nil"/>
+              <w:right w:val="nil"/>
+            </w:tcBorders>
+          </w:tcPr>
+          <w:p>
+            <w:pPr/>
+          </w:p>
+        </w:tc>
+        <w:tc>
+          <w:tcPr>
+            <w:tcW w:w="6400" w:type="dxa"/>
+            <w:vAlign w:val="top"/>
+            <w:tcBorders>
+              <w:top w:val="nil"/>
+              <w:left w:val="nil"/>
+              <w:bottom w:val="nil"/>
+              <w:right w:val="nil"/>
+            </w:tcBorders>
+          </w:tcPr>
+          <w:p>
+            <w:pPr>
+              <w:jc w:val="left"/>
+              <w:spacing w:after="24"/>
+            </w:pPr>
+            <w:r>
+              <w:rPr>
+                <w:rFonts w:ascii="Times New Roman" w:hAnsi="Times New Roman"/>
+                <w:sz w:val="30"/>
+                <w:b/>
+              </w:rPr>
+              <w:t xml:space="preserve">{{ds.ProjectContract_Ministry_RecipientBlock_Line1}}</w:t>
+            </w:r>
+          </w:p>
+          <w:p>
+            <w:pPr>
+              <w:jc w:val="left"/>
+              <w:spacing w:after="72"/>
+            </w:pPr>
+            <w:r>
+              <w:rPr>
+                <w:rFonts w:ascii="Times New Roman" w:hAnsi="Times New Roman"/>
+                <w:sz w:val="30"/>
+                <w:b/>
+              </w:rPr>
+              <w:t xml:space="preserve">{?{ds.ProjectContract_Ministry_RecipientBlock_HasLine2}}{{ds.ProjectContract_Ministry_RecipientBlock_Line2}}{{/}}</w:t>
+            </w:r>
+          </w:p>
+        </w:tc>
+      </w:tr>
+    </w:tbl>
+    <w:p>
+      <w:pPr>
+        <w:jc w:val="left"/>
         <w:spacing w:after="72"/>
-      </w:pPr>
-      <w:r>
-        <w:rPr>
-          <w:rFonts w:ascii="Times New Roman" w:hAnsi="Times New Roman"/>
-          <w:sz w:val="30"/>
-          <w:b/>
-        </w:rPr>
-        <w:t xml:space="preserve">{?{ds.ProjectContract_Ministry_RecipientBlock_HasLine2}}{{ds.ProjectContract_Ministry_RecipientBlock_Line2}}{{/}}</w:t>
-      </w:r>
-    </w:p>
-    <w:p>
-      <w:pPr>
-        <w:jc w:val="left"/>
-        <w:spacing w:after="0"/>
       </w:pPr>
       <w:r>
         <w:rPr>
           <w:rFonts w:ascii="Times New Roman" w:hAnsi="Times New Roman"/>
           <w:sz w:val="24"/>
           <w:i/>
+          <w:u w:val="none"/>
+          <w:color w:val="000000"/>
         </w:rPr>
         <w:t xml:space="preserve">{{ds.Urgency_NameTm}}</w:t>
       </w:r>
     </w:p>
     <w:p>
       <w:pPr>
-        <w:spacing w:after="72"/>
-      </w:pPr>
-    </w:p>
-    <w:p>
-      <w:pPr>
         <w:jc w:val="center"/>
-        <w:spacing w:after="48"/>
+        <w:spacing w:after="200"/>
       </w:pPr>
       <w:r>
         <w:rPr>
           <w:rFonts w:ascii="Times New Roman" w:hAnsi="Times New Roman"/>
           <w:sz w:val="30"/>
           <w:b/>
+          <w:u w:val="none"/>
+          <w:color w:val="000000"/>
         </w:rPr>
         <w:t xml:space="preserve">{{ds.ProjectContract_Ministry_FormOfAddress}}</w:t>
       </w:r>
     </w:p>
-    <w:p/>
     <w:p>
       <w:pPr>
         <w:jc w:val="both"/>
@@ -208,7 +252,7 @@
     <w:p>
       <w:pPr>
         <w:jc w:val="left"/>
-        <w:spacing w:after="0"/>
+        <w:spacing w:after="80"/>
       </w:pPr>
       <w:r>
         <w:rPr>
@@ -217,11 +261,6 @@
         </w:rPr>
         <w:t xml:space="preserve">                2. Goşundy ({{ds.TotalPersonCount}}-daşary ýurt raýatynyň maglumaty)</w:t>
       </w:r>
-    </w:p>
-    <w:p>
-      <w:pPr>
-        <w:spacing w:after="80"/>
-      </w:pPr>
     </w:p>
     <w:tbl>
       <w:tblPr>
@@ -255,7 +294,7 @@
           <w:p>
             <w:pPr>
               <w:jc w:val="left"/>
-              <w:spacing w:before="320" w:after="0"/>
+              <w:spacing w:before="160" w:after="0"/>
             </w:pPr>
             <w:r>
               <w:rPr>
@@ -281,7 +320,7 @@
           <w:p>
             <w:pPr>
               <w:jc w:val="right"/>
-              <w:spacing w:before="320" w:after="0"/>
+              <w:spacing w:before="160" w:after="0"/>
             </w:pPr>
             <w:r>
               <w:rPr>

</xml_diff>